<commit_message>
updated from jetstream atomosphere instance
svn-revision: 815
</commit_message>
<xml_diff>
--- a/files/About us.docx
+++ b/files/About us.docx
@@ -73,60 +73,135 @@
     <w:p>
       <w:pPr>
         <w:spacing w:after="0"/>
-        <w:jc w:val="center"/>
-        <w:rPr>
-          <w:sz w:val="28"/>
-          <w:szCs w:val="28"/>
-        </w:rPr>
-      </w:pPr>
-    </w:p>
-    <w:p>
-      <w:pPr>
-        <w:spacing w:after="0"/>
         <w:rPr>
           <w:sz w:val="32"/>
           <w:szCs w:val="32"/>
         </w:rPr>
       </w:pPr>
-      <w:r>
+    </w:p>
+    <w:p>
+      <w:pPr>
+        <w:spacing w:after="0"/>
         <w:rPr>
           <w:sz w:val="32"/>
           <w:szCs w:val="32"/>
         </w:rPr>
-        <w:t>The Linear and Nonlinear Dynamics and Vibrations Laboratory (LNDVL) at the University of Illinois was formed as the result of a merger, in 1998, of Dr. Alexander Vakakis’s and Dr. Lawrence A. Bergman’s own laboratories. With the addition of Dr. Michael McFarland to the group, and with the assistance of the Departments of Mechanical Science and Engineering (MechSE) and Aerospace Engineering, the College of Engineering, support from federal and industrial sponsors, and numerous graduate and undergraduate students the Laboratory has evolved to its present state.</w:t>
-      </w:r>
-    </w:p>
-    <w:p>
-      <w:pPr>
-        <w:spacing w:after="0"/>
+      </w:pPr>
+      <w:r>
         <w:rPr>
           <w:sz w:val="32"/>
           <w:szCs w:val="32"/>
         </w:rPr>
-      </w:pPr>
-    </w:p>
-    <w:p>
-      <w:pPr>
-        <w:spacing w:after="0"/>
+        <w:t>Current research thrusts include the implementation of passive nonlinear targeted energy transfer for aeroelastic instability (flutter) suppression, vortex-induced vibration suppression, seismic mitigation, blast protection, and vibration/shock isolation of mechanical and structu</w:t>
+      </w:r>
+      <w:r>
         <w:rPr>
           <w:sz w:val="32"/>
           <w:szCs w:val="32"/>
         </w:rPr>
-      </w:pPr>
+        <w:t>ral components; dynamics of non</w:t>
+      </w:r>
       <w:r>
         <w:rPr>
           <w:sz w:val="32"/>
           <w:szCs w:val="32"/>
         </w:rPr>
-        <w:t xml:space="preserve">Current research thrusts include the implementation of passive nonlinear targeted energy transfer for aeroelastic instability (flutter) suppression, vortex-induced vibration suppression, seismic mitigation, blast protection, and vibration/shock isolation of mechanical and structural components; dynamics of non-smooth dynamical systems, with emphasis to vibro-impacting systems and systems with friction; </w:t>
+        <w:t>smooth dyn</w:t>
       </w:r>
       <w:r>
         <w:rPr>
           <w:sz w:val="32"/>
           <w:szCs w:val="32"/>
         </w:rPr>
+        <w:t>amical systems, with emphasis on</w:t>
+      </w:r>
+      <w:r>
+        <w:rPr>
+          <w:sz w:val="32"/>
+          <w:szCs w:val="32"/>
+        </w:rPr>
+        <w:t xml:space="preserve"> vibro-impacting systems and systems with friction; nonlinear system i</w:t>
+      </w:r>
+      <w:r>
+        <w:rPr>
+          <w:sz w:val="32"/>
+          <w:szCs w:val="32"/>
+        </w:rPr>
+        <w:t xml:space="preserve">dentification and reduced-order </w:t>
+      </w:r>
+      <w:r>
+        <w:rPr>
+          <w:sz w:val="32"/>
+          <w:szCs w:val="32"/>
+        </w:rPr>
+        <w:t>modeling; structural health monitoring and damage detection; essentially nonlinear structural acoustics of granular media; strongly nonlinear micro- and nano-resonators; nonlinear vibration energy harvesting; and theoretical studies of dynamical sys</w:t>
+      </w:r>
+      <w:r>
+        <w:rPr>
+          <w:sz w:val="32"/>
+          <w:szCs w:val="32"/>
+        </w:rPr>
+        <w:t>tems and bifurcations in higher-</w:t>
+      </w:r>
+      <w:r>
+        <w:rPr>
+          <w:sz w:val="32"/>
+          <w:szCs w:val="32"/>
+        </w:rPr>
+        <w:t>dimensional settings.</w:t>
+      </w:r>
+    </w:p>
+    <w:p>
+      <w:pPr>
+        <w:spacing w:after="0"/>
+        <w:jc w:val="center"/>
+        <w:rPr>
+          <w:sz w:val="44"/>
+          <w:szCs w:val="44"/>
+        </w:rPr>
+      </w:pPr>
+      <w:r>
+        <w:rPr>
+          <w:sz w:val="44"/>
+          <w:szCs w:val="44"/>
+        </w:rPr>
+        <w:t xml:space="preserve">Fluid Mechanics Research </w:t>
+      </w:r>
+      <w:r>
+        <w:rPr>
+          <w:sz w:val="44"/>
+          <w:szCs w:val="44"/>
+        </w:rPr>
+        <w:t>Laboratory at the University of Illinois at Urbana-Champaign</w:t>
+      </w:r>
+    </w:p>
+    <w:p>
+      <w:pPr>
+        <w:spacing w:after="0"/>
+        <w:jc w:val="center"/>
+        <w:rPr>
+          <w:sz w:val="36"/>
+          <w:szCs w:val="36"/>
+        </w:rPr>
+      </w:pPr>
+    </w:p>
+    <w:p>
+      <w:pPr>
+        <w:spacing w:after="0"/>
+        <w:jc w:val="center"/>
+        <w:rPr>
+          <w:sz w:val="36"/>
+          <w:szCs w:val="36"/>
+        </w:rPr>
+      </w:pPr>
+      <w:r>
+        <w:rPr>
+          <w:sz w:val="36"/>
+          <w:szCs w:val="36"/>
+          <w:highlight w:val="yellow"/>
+        </w:rPr>
         <w:lastRenderedPageBreak/>
-        <w:t>nonlinear system identification and reduced order modeling; structural health monitoring and damage detection; essentially nonlinear structural acoustics of granular media; strongly nonlinear micro- and nano-resonators; nonlinear vibration energy harvesting; and theoretical studies of dynamical systems and bifurcations in higher dimensional settings.</w:t>
+        <w:t>Link from ajp</w:t>
       </w:r>
     </w:p>
     <w:p>
@@ -143,7 +218,7 @@
           <w:sz w:val="36"/>
           <w:szCs w:val="36"/>
         </w:rPr>
-        <w:t>Linear and Nonlinear Dynamics and Vibrations Laboratory Personnel In</w:t>
+        <w:t>Personnel In</w:t>
       </w:r>
       <w:r>
         <w:rPr>
@@ -159,6 +234,16 @@
         </w:rPr>
         <w:t>:</w:t>
       </w:r>
+    </w:p>
+    <w:p>
+      <w:pPr>
+        <w:spacing w:after="0"/>
+        <w:jc w:val="center"/>
+        <w:rPr>
+          <w:sz w:val="36"/>
+          <w:szCs w:val="36"/>
+        </w:rPr>
+      </w:pPr>
       <w:r>
         <w:rPr>
           <w:sz w:val="24"/>
@@ -183,6 +268,7 @@
           <w:szCs w:val="36"/>
         </w:rPr>
       </w:pPr>
+      <w:bookmarkStart w:id="0" w:name="_GoBack"/>
       <w:r>
         <w:rPr>
           <w:noProof/>
@@ -191,9 +277,9 @@
         </w:rPr>
         <w:drawing>
           <wp:inline distT="0" distB="0" distL="0" distR="0">
-            <wp:extent cx="5943600" cy="3129915"/>
+            <wp:extent cx="7756630" cy="3124200"/>
             <wp:effectExtent l="0" t="0" r="0" b="0"/>
-            <wp:docPr id="9" name="Picture 9"/>
+            <wp:docPr id="2" name="Picture 2"/>
             <wp:cNvGraphicFramePr>
               <a:graphicFrameLocks xmlns:a="http://schemas.openxmlformats.org/drawingml/2006/main" noChangeAspect="1"/>
             </wp:cNvGraphicFramePr>
@@ -201,7 +287,7 @@
               <a:graphicData uri="http://schemas.openxmlformats.org/drawingml/2006/picture">
                 <pic:pic xmlns:pic="http://schemas.openxmlformats.org/drawingml/2006/picture">
                   <pic:nvPicPr>
-                    <pic:cNvPr id="9" name="about.png"/>
+                    <pic:cNvPr id="2" name="aboutact.png"/>
                     <pic:cNvPicPr/>
                   </pic:nvPicPr>
                   <pic:blipFill>
@@ -219,7 +305,7 @@
                   <pic:spPr>
                     <a:xfrm>
                       <a:off x="0" y="0"/>
-                      <a:ext cx="5943600" cy="3129915"/>
+                      <a:ext cx="7876074" cy="3172309"/>
                     </a:xfrm>
                     <a:prstGeom prst="rect">
                       <a:avLst/>
@@ -231,6 +317,7 @@
           </wp:inline>
         </w:drawing>
       </w:r>
+      <w:bookmarkEnd w:id="0"/>
     </w:p>
     <w:p>
       <w:pPr>
@@ -246,28 +333,36 @@
           <w:sz w:val="36"/>
           <w:szCs w:val="36"/>
         </w:rPr>
-        <w:t>With Additional Assistance From</w:t>
-      </w:r>
-    </w:p>
-    <w:p>
-      <w:pPr>
-        <w:jc w:val="center"/>
-        <w:rPr>
-          <w:sz w:val="72"/>
-          <w:szCs w:val="72"/>
+        <w:t>Graduate Assistants</w:t>
+      </w:r>
+      <w:r>
+        <w:rPr>
+          <w:sz w:val="36"/>
+          <w:szCs w:val="36"/>
+        </w:rPr>
+        <w:t>:</w:t>
+      </w:r>
+    </w:p>
+    <w:p>
+      <w:pPr>
+        <w:spacing w:after="0"/>
+        <w:jc w:val="center"/>
+        <w:rPr>
+          <w:sz w:val="36"/>
+          <w:szCs w:val="36"/>
         </w:rPr>
       </w:pPr>
       <w:r>
         <w:rPr>
           <w:noProof/>
-          <w:sz w:val="72"/>
-          <w:szCs w:val="72"/>
+          <w:sz w:val="36"/>
+          <w:szCs w:val="36"/>
         </w:rPr>
         <w:drawing>
           <wp:inline distT="0" distB="0" distL="0" distR="0">
-            <wp:extent cx="1782500" cy="2560320"/>
-            <wp:effectExtent l="0" t="0" r="8255" b="0"/>
-            <wp:docPr id="7" name="Picture 7"/>
+            <wp:extent cx="5943600" cy="2620645"/>
+            <wp:effectExtent l="0" t="0" r="0" b="8255"/>
+            <wp:docPr id="3" name="Picture 3"/>
             <wp:cNvGraphicFramePr>
               <a:graphicFrameLocks xmlns:a="http://schemas.openxmlformats.org/drawingml/2006/main" noChangeAspect="1"/>
             </wp:cNvGraphicFramePr>
@@ -275,7 +370,7 @@
               <a:graphicData uri="http://schemas.openxmlformats.org/drawingml/2006/picture">
                 <pic:pic xmlns:pic="http://schemas.openxmlformats.org/drawingml/2006/picture">
                   <pic:nvPicPr>
-                    <pic:cNvPr id="7" name="about2.png"/>
+                    <pic:cNvPr id="3" name="ab2.png"/>
                     <pic:cNvPicPr/>
                   </pic:nvPicPr>
                   <pic:blipFill>
@@ -293,7 +388,7 @@
                   <pic:spPr>
                     <a:xfrm>
                       <a:off x="0" y="0"/>
-                      <a:ext cx="1789779" cy="2570776"/>
+                      <a:ext cx="5943600" cy="2620645"/>
                     </a:xfrm>
                     <a:prstGeom prst="rect">
                       <a:avLst/>
@@ -310,28 +405,26 @@
       <w:pPr>
         <w:jc w:val="center"/>
         <w:rPr>
-          <w:sz w:val="32"/>
-          <w:szCs w:val="32"/>
-        </w:rPr>
-      </w:pPr>
-      <w:hyperlink r:id="rId9" w:history="1">
-        <w:r>
-          <w:rPr>
-            <w:rStyle w:val="Hyperlink"/>
-            <w:sz w:val="32"/>
-            <w:szCs w:val="32"/>
-          </w:rPr>
-          <w:t>https://mechanical.illinois.edu/directory/faculty/ajp</w:t>
-        </w:r>
-      </w:hyperlink>
-    </w:p>
-    <w:p>
-      <w:pPr>
+          <w:sz w:val="72"/>
+          <w:szCs w:val="72"/>
+        </w:rPr>
+      </w:pPr>
+    </w:p>
+    <w:p>
+      <w:pPr>
+        <w:jc w:val="center"/>
         <w:rPr>
           <w:sz w:val="28"/>
           <w:szCs w:val="28"/>
         </w:rPr>
       </w:pPr>
+      <w:r>
+        <w:rPr>
+          <w:sz w:val="28"/>
+          <w:szCs w:val="28"/>
+        </w:rPr>
+        <w:t>Undergraduate Assistant:</w:t>
+      </w:r>
     </w:p>
     <w:p>
       <w:pPr>
@@ -347,6 +440,7 @@
           <w:sz w:val="72"/>
           <w:szCs w:val="72"/>
         </w:rPr>
+        <w:lastRenderedPageBreak/>
         <w:drawing>
           <wp:inline distT="0" distB="0" distL="0" distR="0">
             <wp:extent cx="1807955" cy="2141220"/>
@@ -363,7 +457,7 @@
                     <pic:cNvPicPr/>
                   </pic:nvPicPr>
                   <pic:blipFill>
-                    <a:blip r:embed="rId10">
+                    <a:blip r:embed="rId9">
                       <a:extLst>
                         <a:ext uri="{28A0092B-C50C-407E-A947-70E740481C1C}">
                           <a14:useLocalDpi xmlns:a14="http://schemas.microsoft.com/office/drawing/2010/main" val="0"/>
@@ -394,67 +488,10 @@
       <w:pPr>
         <w:jc w:val="center"/>
         <w:rPr>
-          <w:sz w:val="28"/>
-          <w:szCs w:val="28"/>
-        </w:rPr>
-      </w:pPr>
-      <w:r>
-        <w:rPr>
-          <w:sz w:val="28"/>
-          <w:szCs w:val="28"/>
-        </w:rPr>
-        <w:t>Undergraduate Assistant</w:t>
-      </w:r>
-    </w:p>
-    <w:p>
-      <w:pPr>
-        <w:jc w:val="center"/>
-        <w:rPr>
-          <w:sz w:val="36"/>
-          <w:szCs w:val="36"/>
-        </w:rPr>
-      </w:pPr>
-    </w:p>
-    <w:p>
-      <w:pPr>
-        <w:jc w:val="center"/>
-        <w:rPr>
-          <w:sz w:val="36"/>
-          <w:szCs w:val="36"/>
-        </w:rPr>
-      </w:pPr>
-      <w:bookmarkStart w:id="0" w:name="_GoBack"/>
-      <w:bookmarkEnd w:id="0"/>
-      <w:r>
-        <w:rPr>
-          <w:sz w:val="36"/>
-          <w:szCs w:val="36"/>
-        </w:rPr>
-        <w:t>Publications</w:t>
-      </w:r>
-      <w:r>
-        <w:rPr>
-          <w:sz w:val="36"/>
-          <w:szCs w:val="36"/>
-        </w:rPr>
-        <w:t>:</w:t>
-      </w:r>
-    </w:p>
-    <w:p>
-      <w:pPr>
-        <w:jc w:val="center"/>
-        <w:rPr>
-          <w:sz w:val="36"/>
-          <w:szCs w:val="36"/>
-        </w:rPr>
-      </w:pPr>
-      <w:r>
-        <w:rPr>
-          <w:sz w:val="36"/>
-          <w:szCs w:val="36"/>
-        </w:rPr>
-        <w:t>To Be Determined</w:t>
-      </w:r>
+          <w:sz w:val="36"/>
+          <w:szCs w:val="36"/>
+        </w:rPr>
+      </w:pPr>
     </w:p>
     <w:p>
       <w:pPr>

</xml_diff>

<commit_message>
update svn to live version
svn-revision: 1050
</commit_message>
<xml_diff>
--- a/files/About us.docx
+++ b/files/About us.docx
@@ -183,17 +183,7 @@
             <w:sz w:val="36"/>
             <w:szCs w:val="36"/>
           </w:rPr>
-          <w:t>https://mechanical.illinois.edu/research/mechse-</w:t>
-        </w:r>
-        <w:bookmarkStart w:id="0" w:name="_GoBack"/>
-        <w:bookmarkEnd w:id="0"/>
-        <w:r>
-          <w:rPr>
-            <w:rStyle w:val="Hyperlink"/>
-            <w:sz w:val="36"/>
-            <w:szCs w:val="36"/>
-          </w:rPr>
-          <w:t>laboratories/fluid-mechanics-research-lab</w:t>
+          <w:t>https://mechanical.illinois.edu/research/mechse-laboratories/fluid-mechanics-research-lab</w:t>
         </w:r>
       </w:hyperlink>
     </w:p>
@@ -219,7 +209,7 @@
           <w:sz w:val="32"/>
           <w:szCs w:val="32"/>
         </w:rPr>
-        <w:t xml:space="preserve">Current applications of interest are directional solidification of alloys and electronic materials, motion of deformable drops at intermediate Reynolds number in tubes, effect of cylinder rotation on the transition to three-dimensionality in cylinder wakes, nonvertical, unsteady motion </w:t>
+        <w:t xml:space="preserve">Our research is mostly computational and theoretical and is primarily in the area of incompressible fluid mechanics, including stability of shear and buoyancy-driven flows, development of computational methods, and free-surface phenomena.  Current projects include computations of </w:t>
       </w:r>
       <w:r>
         <w:rPr>
@@ -227,7 +217,7 @@
           <w:szCs w:val="32"/>
         </w:rPr>
         <w:lastRenderedPageBreak/>
-        <w:t>of falling spheres, development of low-order (ordinary differential equation) models of complex flows, and development of techniques for extracting the velocity field from measurements of advected scalars.</w:t>
+        <w:t>the unsteady deformation and dissolution of water-soluble liquid carbon dioxide drops rising in water at intermediate and transitional Reynolds numbers; vortex shedding, vortex-induced vibration, and the development of temporal chaos and three-dimensionality in the wakes of circular and noncircular cylinders, with applications to suppressing vibration and power generation; the development of low-order (ordinary differential equation) models of complex flows; and the fluid mechanics of bacterial inactivation in fresh-cut vegetable processing.  To facilitate the application of particle image velocimetry and other modern optical diagnostics to liquid-liquid flows (where that is currently not possible, due to either opacity or refractive index mismatch), we are (experimentally) developing pairs of ternary (three-component) immiscible transparent liquids for which the compositions can be adjusted so as to match the index of refraction over wide ranges of the liquid-liquid density ratio and viscosity ratio.</w:t>
       </w:r>
     </w:p>
     <w:p>
@@ -331,8 +321,8 @@
         </w:rPr>
         <w:drawing>
           <wp:inline distT="0" distB="0" distL="0" distR="0">
-            <wp:extent cx="5600700" cy="2050650"/>
-            <wp:effectExtent l="0" t="0" r="0" b="6985"/>
+            <wp:extent cx="7013515" cy="2567940"/>
+            <wp:effectExtent l="0" t="0" r="0" b="3810"/>
             <wp:docPr id="7" name="Picture 7"/>
             <wp:cNvGraphicFramePr>
               <a:graphicFrameLocks xmlns:a="http://schemas.openxmlformats.org/drawingml/2006/main" noChangeAspect="1"/>
@@ -359,7 +349,7 @@
                   <pic:spPr>
                     <a:xfrm>
                       <a:off x="0" y="0"/>
-                      <a:ext cx="5634232" cy="2062927"/>
+                      <a:ext cx="7073492" cy="2589900"/>
                     </a:xfrm>
                     <a:prstGeom prst="rect">
                       <a:avLst/>
@@ -411,10 +401,11 @@
           <w:sz w:val="36"/>
           <w:szCs w:val="36"/>
         </w:rPr>
+        <w:lastRenderedPageBreak/>
         <w:drawing>
           <wp:inline distT="0" distB="0" distL="0" distR="0">
-            <wp:extent cx="4076700" cy="1910300"/>
-            <wp:effectExtent l="0" t="0" r="0" b="0"/>
+            <wp:extent cx="4876800" cy="2285219"/>
+            <wp:effectExtent l="0" t="0" r="0" b="1270"/>
             <wp:docPr id="4" name="Picture 4"/>
             <wp:cNvGraphicFramePr>
               <a:graphicFrameLocks xmlns:a="http://schemas.openxmlformats.org/drawingml/2006/main" noChangeAspect="1"/>
@@ -441,7 +432,7 @@
                   <pic:spPr>
                     <a:xfrm>
                       <a:off x="0" y="0"/>
-                      <a:ext cx="4235512" cy="1984718"/>
+                      <a:ext cx="5079024" cy="2379979"/>
                     </a:xfrm>
                     <a:prstGeom prst="rect">
                       <a:avLst/>
@@ -493,11 +484,10 @@
           <w:sz w:val="72"/>
           <w:szCs w:val="72"/>
         </w:rPr>
-        <w:lastRenderedPageBreak/>
         <w:drawing>
           <wp:inline distT="0" distB="0" distL="0" distR="0">
-            <wp:extent cx="1529985" cy="2247900"/>
-            <wp:effectExtent l="0" t="0" r="0" b="0"/>
+            <wp:extent cx="1821180" cy="2675732"/>
+            <wp:effectExtent l="0" t="0" r="7620" b="0"/>
             <wp:docPr id="5" name="Picture 5"/>
             <wp:cNvGraphicFramePr>
               <a:graphicFrameLocks xmlns:a="http://schemas.openxmlformats.org/drawingml/2006/main" noChangeAspect="1"/>
@@ -524,7 +514,7 @@
                   <pic:spPr>
                     <a:xfrm>
                       <a:off x="0" y="0"/>
-                      <a:ext cx="1567683" cy="2303287"/>
+                      <a:ext cx="1871867" cy="2750202"/>
                     </a:xfrm>
                     <a:prstGeom prst="rect">
                       <a:avLst/>
@@ -536,30 +526,55 @@
           </wp:inline>
         </w:drawing>
       </w:r>
-    </w:p>
-    <w:p>
-      <w:pPr>
-        <w:jc w:val="center"/>
-        <w:rPr>
-          <w:sz w:val="36"/>
-          <w:szCs w:val="36"/>
-        </w:rPr>
-      </w:pPr>
-    </w:p>
-    <w:p>
-      <w:pPr>
-        <w:rPr>
-          <w:sz w:val="36"/>
-          <w:szCs w:val="36"/>
-        </w:rPr>
-      </w:pPr>
-      <w:r>
+      <w:bookmarkStart w:id="0" w:name="_GoBack"/>
+      <w:bookmarkEnd w:id="0"/>
+    </w:p>
+    <w:p>
+      <w:pPr>
+        <w:jc w:val="center"/>
+        <w:rPr>
+          <w:sz w:val="36"/>
+          <w:szCs w:val="36"/>
+        </w:rPr>
+      </w:pPr>
+    </w:p>
+    <w:p>
+      <w:pPr>
         <w:rPr>
           <w:sz w:val="72"/>
           <w:szCs w:val="72"/>
         </w:rPr>
+      </w:pPr>
+      <w:r>
+        <w:rPr>
+          <w:sz w:val="72"/>
+          <w:szCs w:val="72"/>
+        </w:rPr>
+        <w:t>__imagesize:original__</w:t>
+      </w:r>
+    </w:p>
+    <w:p>
+      <w:pPr>
+        <w:rPr>
+          <w:sz w:val="72"/>
+          <w:szCs w:val="72"/>
+        </w:rPr>
+      </w:pPr>
+      <w:r>
+        <w:rPr>
+          <w:sz w:val="72"/>
+          <w:szCs w:val="72"/>
+        </w:rPr>
         <w:t>__hr__</w:t>
       </w:r>
+    </w:p>
+    <w:p>
+      <w:pPr>
+        <w:rPr>
+          <w:sz w:val="36"/>
+          <w:szCs w:val="36"/>
+        </w:rPr>
+      </w:pPr>
     </w:p>
     <w:p>
       <w:pPr>

</xml_diff>